<commit_message>
Corregge inquadramento normativo: Titolo IV (cantieri temporanei o mobili) anziche' art. 26
</commit_message>
<xml_diff>
--- a/Documento_Informativo_Ditte_Bacino_Ferrati_Fasc_2511-25_2509-25.docx
+++ b/Documento_Informativo_Ditte_Bacino_Ferrati_Fasc_2511-25_2509-25.docx
@@ -76,7 +76,7 @@
           <w:color w:val="595959"/>
           <w:sz w:val="22"/>
         </w:rPr>
-        <w:t>ai sensi dell'art. 26, comma 1, lettera b) del D.Lgs. 81/2008 e s.m.i.</w:t>
+        <w:t>redatto nell'ambito del Titolo IV del D.Lgs. 81/2008 e s.m.i. (cantieri temporanei o mobili)</w:t>
       </w:r>
     </w:p>
     <w:p>
@@ -437,7 +437,7 @@
           <w:i w:val="0"/>
           <w:sz w:val="21"/>
         </w:rPr>
-        <w:t>Lo scopo del presente documento e' quello di fornire le informazioni, ai sensi dell'art. 26 comma 1 lettera b) del D.Lgs. 81/2008 e s.m.i., relative ai luoghi di lavoro oggetto del contratto e dipendenti dal Datore di lavoro di Marinarsen Taranto, nonche' gli elementi essenziali di conoscenza dell'organizzazione interna dell'Arsenale Militare Marittimo di Taranto.</w:t>
+        <w:t>Le attivita' oggetto del presente documento ricadono nel campo di applicazione del Titolo IV del D.Lgs. 81/2008 e s.m.i. (cantieri temporanei o mobili). Per tali lavorazioni il Committente ha provveduto, ai sensi degli artt. 90 e 91 del D.Lgs. 81/2008, alla designazione del Coordinatore per la Sicurezza in fase di Progettazione ed Esecuzione (CSP/CSE) nella persona dell'Ing. Vincenzo Marasciulo della Societa' Italiana S.r.l. e alla redazione del Piano di Sicurezza e Coordinamento (PSC_Ferrati Rev. 5).</w:t>
       </w:r>
     </w:p>
     <w:p>
@@ -450,7 +450,7 @@
           <w:i w:val="0"/>
           <w:sz w:val="21"/>
         </w:rPr>
-        <w:t>Le attivita' ricadono nel campo di applicazione del Titolo IV del D.Lgs. 81/2008 (cantieri temporanei o mobili), con Coordinamento della Sicurezza in fase di Progettazione ed Esecuzione (CSP/CSE) affidato all'Ing. Vincenzo Marasciulo della Societa' Italiana S.r.l. Le lavorazioni costituiscono la prosecuzione, per scelta condivisa, di quelle gia' effettuate per la pulizia del bacino dalle taccate in legno e in calcestruzzo. Il presente documento informativo integra e non sostituisce il Piano di Sicurezza e Coordinamento (PSC_Ferrati Rev. 5) e i Piani Operativi di Sicurezza (POS) delle singole imprese.</w:t>
+        <w:t>Trattandosi di lavori soggetti al Titolo IV, gli obblighi di cui all'art. 26 commi 1, 2 e 3 del D.Lgs. 81/2008 (ivi compresa la redazione del DUVRI) non trovano applicazione, ai sensi dell'art. 26 comma 3-bis: la gestione dei rischi interferenziali e' assicurata dal PSC e dall'azione di coordinamento del CSE. Scopo del presente documento e' fornire alle imprese affidatarie ed esecutrici le informazioni relative ai luoghi di lavoro dipendenti dal Datore di lavoro di Marinarsen Taranto, ai rischi specifici esistenti nell'ambiente di lavoro e alle misure di emergenza adottate, nonche' gli elementi essenziali di conoscenza dell'organizzazione interna dell'Arsenale Militare Marittimo di Taranto, a integrazione e non in sostituzione del PSC e dei Piani Operativi di Sicurezza (POS) delle singole imprese.</w:t>
       </w:r>
     </w:p>
     <w:p>
@@ -463,7 +463,7 @@
           <w:i w:val="0"/>
           <w:sz w:val="21"/>
         </w:rPr>
-        <w:t>Ai sensi dell'art. 26 comma 3 del D.Lgs. 81/2008, le Ditte affidatarie ed esecutrici sono tenute a partecipare alle riunioni di coordinamento indette dal CSE e a prendere visione del PSC e del relativo cronoprogramma, il cui aggiornamento e' obbligatorio al mutare delle condizioni operative o all'insorgere di nuovi rischi. Ogni variazione logistica, tecnica o di personale dovra' essere preventivamente comunicata al DEC, al CSE e al RSPP.</w:t>
+        <w:t>Le lavorazioni costituiscono la prosecuzione, per scelta condivisa, di quelle gia' effettuate per la pulizia del bacino dalle taccate in legno e in calcestruzzo. Ai sensi degli artt. 92, 96 e 100 del D.Lgs. 81/2008, le Ditte affidatarie ed esecutrici sono tenute ad attuare quanto previsto nel PSC, a redigere e trasmettere il proprio POS, a partecipare alle riunioni di coordinamento indette dal CSE e a rispettare il cronoprogramma dei lavori, il cui aggiornamento e' obbligatorio al mutare delle condizioni operative o all'insorgere di nuovi rischi. Ogni variazione logistica, tecnica o di personale dovra' essere preventivamente comunicata al DEC, al CSE e al RSPP.</w:t>
       </w:r>
     </w:p>
     <w:p>
@@ -4320,7 +4320,7 @@
               <w:color w:val="1F3A5F"/>
               <w:sz w:val="17"/>
             </w:rPr>
-            <w:t>- D.Lgs. 81/2008 Art. 26 comma 1 lett. b -</w:t>
+            <w:t>- D.Lgs. 81/2008 - Titolo IV -</w:t>
           </w:r>
         </w:p>
       </w:tc>

</xml_diff>